<commit_message>
maintain formatting, update toc
</commit_message>
<xml_diff>
--- a/task4_elicitation/TT2L_G7_ElicitationOutput.docx
+++ b/task4_elicitation/TT2L_G7_ElicitationOutput.docx
@@ -34,7 +34,7 @@
           <w:szCs w:val="28"/>
         </w:rPr>
         <w:drawing>
-          <wp:inline distT="0" distB="0" distL="0" distR="0" wp14:anchorId="143BE505" wp14:editId="51EA6719">
+          <wp:inline distT="0" distB="0" distL="0" distR="0" wp14:anchorId="143BE505" wp14:editId="1EA44157">
             <wp:extent cx="2637790" cy="914400"/>
             <wp:effectExtent l="0" t="0" r="0" b="0"/>
             <wp:docPr id="84340833" name="Picture 2" descr="C:\Users\USER\Downloads\MMU-New-logo-png.png"/>
@@ -570,7 +570,7 @@
       <w:pPr>
         <w:pStyle w:val="TNRHeading1"/>
       </w:pPr>
-      <w:bookmarkStart w:id="0" w:name="_Toc199005666"/>
+      <w:bookmarkStart w:id="0" w:name="_Toc199059248"/>
       <w:r>
         <w:lastRenderedPageBreak/>
         <w:t>Table of Contents</w:t>
@@ -600,7 +600,7 @@
       <w:r>
         <w:fldChar w:fldCharType="separate"/>
       </w:r>
-      <w:hyperlink w:anchor="_Toc199005666" w:history="1">
+      <w:hyperlink w:anchor="_Toc199059248" w:history="1">
         <w:r>
           <w:rPr>
             <w:rStyle w:val="Hyperlink"/>
@@ -627,7 +627,7 @@
             <w:noProof/>
             <w:webHidden/>
           </w:rPr>
-          <w:instrText xml:space="preserve"> PAGEREF _Toc199005666 \h </w:instrText>
+          <w:instrText xml:space="preserve"> PAGEREF _Toc199059248 \h </w:instrText>
         </w:r>
         <w:r>
           <w:rPr>
@@ -672,7 +672,7 @@
           <w14:ligatures w14:val="standardContextual"/>
         </w:rPr>
       </w:pPr>
-      <w:hyperlink w:anchor="_Toc199005667" w:history="1">
+      <w:hyperlink w:anchor="_Toc199059249" w:history="1">
         <w:r>
           <w:rPr>
             <w:rStyle w:val="Hyperlink"/>
@@ -699,7 +699,7 @@
             <w:noProof/>
             <w:webHidden/>
           </w:rPr>
-          <w:instrText xml:space="preserve"> PAGEREF _Toc199005667 \h </w:instrText>
+          <w:instrText xml:space="preserve"> PAGEREF _Toc199059249 \h </w:instrText>
         </w:r>
         <w:r>
           <w:rPr>
@@ -744,7 +744,7 @@
           <w14:ligatures w14:val="standardContextual"/>
         </w:rPr>
       </w:pPr>
-      <w:hyperlink w:anchor="_Toc199005668" w:history="1">
+      <w:hyperlink w:anchor="_Toc199059250" w:history="1">
         <w:r>
           <w:rPr>
             <w:rStyle w:val="Hyperlink"/>
@@ -771,7 +771,7 @@
             <w:noProof/>
             <w:webHidden/>
           </w:rPr>
-          <w:instrText xml:space="preserve"> PAGEREF _Toc199005668 \h </w:instrText>
+          <w:instrText xml:space="preserve"> PAGEREF _Toc199059250 \h </w:instrText>
         </w:r>
         <w:r>
           <w:rPr>
@@ -816,7 +816,7 @@
           <w14:ligatures w14:val="standardContextual"/>
         </w:rPr>
       </w:pPr>
-      <w:hyperlink w:anchor="_Toc199005669" w:history="1">
+      <w:hyperlink w:anchor="_Toc199059251" w:history="1">
         <w:r>
           <w:rPr>
             <w:rStyle w:val="Hyperlink"/>
@@ -843,7 +843,7 @@
             <w:noProof/>
             <w:webHidden/>
           </w:rPr>
-          <w:instrText xml:space="preserve"> PAGEREF _Toc199005669 \h </w:instrText>
+          <w:instrText xml:space="preserve"> PAGEREF _Toc199059251 \h </w:instrText>
         </w:r>
         <w:r>
           <w:rPr>
@@ -888,7 +888,7 @@
           <w14:ligatures w14:val="standardContextual"/>
         </w:rPr>
       </w:pPr>
-      <w:hyperlink w:anchor="_Toc199005670" w:history="1">
+      <w:hyperlink w:anchor="_Toc199059252" w:history="1">
         <w:r>
           <w:rPr>
             <w:rStyle w:val="Hyperlink"/>
@@ -915,7 +915,7 @@
             <w:noProof/>
             <w:webHidden/>
           </w:rPr>
-          <w:instrText xml:space="preserve"> PAGEREF _Toc199005670 \h </w:instrText>
+          <w:instrText xml:space="preserve"> PAGEREF _Toc199059252 \h </w:instrText>
         </w:r>
         <w:r>
           <w:rPr>
@@ -960,7 +960,7 @@
           <w14:ligatures w14:val="standardContextual"/>
         </w:rPr>
       </w:pPr>
-      <w:hyperlink w:anchor="_Toc199005671" w:history="1">
+      <w:hyperlink w:anchor="_Toc199059253" w:history="1">
         <w:r>
           <w:rPr>
             <w:rStyle w:val="Hyperlink"/>
@@ -987,7 +987,7 @@
             <w:noProof/>
             <w:webHidden/>
           </w:rPr>
-          <w:instrText xml:space="preserve"> PAGEREF _Toc199005671 \h </w:instrText>
+          <w:instrText xml:space="preserve"> PAGEREF _Toc199059253 \h </w:instrText>
         </w:r>
         <w:r>
           <w:rPr>
@@ -1032,7 +1032,7 @@
           <w14:ligatures w14:val="standardContextual"/>
         </w:rPr>
       </w:pPr>
-      <w:hyperlink w:anchor="_Toc199005672" w:history="1">
+      <w:hyperlink w:anchor="_Toc199059254" w:history="1">
         <w:r>
           <w:rPr>
             <w:rStyle w:val="Hyperlink"/>
@@ -1059,7 +1059,7 @@
             <w:noProof/>
             <w:webHidden/>
           </w:rPr>
-          <w:instrText xml:space="preserve"> PAGEREF _Toc199005672 \h </w:instrText>
+          <w:instrText xml:space="preserve"> PAGEREF _Toc199059254 \h </w:instrText>
         </w:r>
         <w:r>
           <w:rPr>
@@ -1104,7 +1104,7 @@
           <w14:ligatures w14:val="standardContextual"/>
         </w:rPr>
       </w:pPr>
-      <w:hyperlink w:anchor="_Toc199005673" w:history="1">
+      <w:hyperlink w:anchor="_Toc199059255" w:history="1">
         <w:r>
           <w:rPr>
             <w:rStyle w:val="Hyperlink"/>
@@ -1131,7 +1131,7 @@
             <w:noProof/>
             <w:webHidden/>
           </w:rPr>
-          <w:instrText xml:space="preserve"> PAGEREF _Toc199005673 \h </w:instrText>
+          <w:instrText xml:space="preserve"> PAGEREF _Toc199059255 \h </w:instrText>
         </w:r>
         <w:r>
           <w:rPr>
@@ -1176,7 +1176,7 @@
           <w14:ligatures w14:val="standardContextual"/>
         </w:rPr>
       </w:pPr>
-      <w:hyperlink w:anchor="_Toc199005674" w:history="1">
+      <w:hyperlink w:anchor="_Toc199059256" w:history="1">
         <w:r>
           <w:rPr>
             <w:rStyle w:val="Hyperlink"/>
@@ -1203,7 +1203,7 @@
             <w:noProof/>
             <w:webHidden/>
           </w:rPr>
-          <w:instrText xml:space="preserve"> PAGEREF _Toc199005674 \h </w:instrText>
+          <w:instrText xml:space="preserve"> PAGEREF _Toc199059256 \h </w:instrText>
         </w:r>
         <w:r>
           <w:rPr>
@@ -1248,7 +1248,7 @@
           <w14:ligatures w14:val="standardContextual"/>
         </w:rPr>
       </w:pPr>
-      <w:hyperlink w:anchor="_Toc199005675" w:history="1">
+      <w:hyperlink w:anchor="_Toc199059257" w:history="1">
         <w:r>
           <w:rPr>
             <w:rStyle w:val="Hyperlink"/>
@@ -1275,7 +1275,7 @@
             <w:noProof/>
             <w:webHidden/>
           </w:rPr>
-          <w:instrText xml:space="preserve"> PAGEREF _Toc199005675 \h </w:instrText>
+          <w:instrText xml:space="preserve"> PAGEREF _Toc199059257 \h </w:instrText>
         </w:r>
         <w:r>
           <w:rPr>
@@ -1295,7 +1295,7 @@
             <w:noProof/>
             <w:webHidden/>
           </w:rPr>
-          <w:t>7</w:t>
+          <w:t>9</w:t>
         </w:r>
         <w:r>
           <w:rPr>
@@ -1320,7 +1320,7 @@
           <w14:ligatures w14:val="standardContextual"/>
         </w:rPr>
       </w:pPr>
-      <w:hyperlink w:anchor="_Toc199005676" w:history="1">
+      <w:hyperlink w:anchor="_Toc199059258" w:history="1">
         <w:r>
           <w:rPr>
             <w:rStyle w:val="Hyperlink"/>
@@ -1347,7 +1347,7 @@
             <w:noProof/>
             <w:webHidden/>
           </w:rPr>
-          <w:instrText xml:space="preserve"> PAGEREF _Toc199005676 \h </w:instrText>
+          <w:instrText xml:space="preserve"> PAGEREF _Toc199059258 \h </w:instrText>
         </w:r>
         <w:r>
           <w:rPr>
@@ -1367,7 +1367,7 @@
             <w:noProof/>
             <w:webHidden/>
           </w:rPr>
-          <w:t>7</w:t>
+          <w:t>9</w:t>
         </w:r>
         <w:r>
           <w:rPr>
@@ -1392,7 +1392,7 @@
           <w14:ligatures w14:val="standardContextual"/>
         </w:rPr>
       </w:pPr>
-      <w:hyperlink w:anchor="_Toc199005677" w:history="1">
+      <w:hyperlink w:anchor="_Toc199059259" w:history="1">
         <w:r>
           <w:rPr>
             <w:rStyle w:val="Hyperlink"/>
@@ -1419,7 +1419,7 @@
             <w:noProof/>
             <w:webHidden/>
           </w:rPr>
-          <w:instrText xml:space="preserve"> PAGEREF _Toc199005677 \h </w:instrText>
+          <w:instrText xml:space="preserve"> PAGEREF _Toc199059259 \h </w:instrText>
         </w:r>
         <w:r>
           <w:rPr>
@@ -1439,7 +1439,7 @@
             <w:noProof/>
             <w:webHidden/>
           </w:rPr>
-          <w:t>8</w:t>
+          <w:t>10</w:t>
         </w:r>
         <w:r>
           <w:rPr>
@@ -1467,7 +1467,7 @@
       <w:pPr>
         <w:pStyle w:val="TNRHeading1"/>
       </w:pPr>
-      <w:bookmarkStart w:id="1" w:name="_Toc199005667"/>
+      <w:bookmarkStart w:id="1" w:name="_Toc199059249"/>
       <w:r>
         <w:lastRenderedPageBreak/>
         <w:t>1 Introduction</w:t>
@@ -1500,7 +1500,7 @@
       <w:pPr>
         <w:pStyle w:val="TNRHeading1"/>
       </w:pPr>
-      <w:bookmarkStart w:id="2" w:name="_Toc199005668"/>
+      <w:bookmarkStart w:id="2" w:name="_Toc199059250"/>
       <w:r>
         <w:t>2 Elicitation Session Overview</w:t>
       </w:r>
@@ -1694,7 +1694,7 @@
       <w:pPr>
         <w:pStyle w:val="TNRHeading1"/>
       </w:pPr>
-      <w:bookmarkStart w:id="3" w:name="_Toc199005669"/>
+      <w:bookmarkStart w:id="3" w:name="_Toc199059251"/>
       <w:r>
         <w:lastRenderedPageBreak/>
         <w:t>3 Requirement Categorization Using Kano Model</w:t>
@@ -2513,7 +2513,7 @@
       <w:pPr>
         <w:pStyle w:val="TNRHeading1"/>
       </w:pPr>
-      <w:bookmarkStart w:id="4" w:name="_Toc199005670"/>
+      <w:bookmarkStart w:id="4" w:name="_Toc199059252"/>
       <w:r>
         <w:lastRenderedPageBreak/>
         <w:t>4 Summary of Elicitation Outcomes</w:t>
@@ -2524,7 +2524,7 @@
       <w:pPr>
         <w:pStyle w:val="TNRHeading2"/>
       </w:pPr>
-      <w:bookmarkStart w:id="5" w:name="_Toc199005671"/>
+      <w:bookmarkStart w:id="5" w:name="_Toc199059253"/>
       <w:r>
         <w:t>4.1 Interview</w:t>
       </w:r>
@@ -2548,7 +2548,7 @@
       <w:pPr>
         <w:pStyle w:val="TNRHeading3"/>
       </w:pPr>
-      <w:bookmarkStart w:id="6" w:name="_Toc199005672"/>
+      <w:bookmarkStart w:id="6" w:name="_Toc199059254"/>
       <w:r>
         <w:t>Structured Interview Summary</w:t>
       </w:r>
@@ -2782,7 +2782,7 @@
       <w:pPr>
         <w:pStyle w:val="TNRHeading2"/>
       </w:pPr>
-      <w:bookmarkStart w:id="7" w:name="_Toc199005673"/>
+      <w:bookmarkStart w:id="7" w:name="_Toc199059255"/>
       <w:r>
         <w:lastRenderedPageBreak/>
         <w:t>4.2 Questionnaire</w:t>
@@ -2877,7 +2877,7 @@
       <w:pPr>
         <w:pStyle w:val="TNRHeading3"/>
       </w:pPr>
-      <w:bookmarkStart w:id="8" w:name="_Toc199005674"/>
+      <w:bookmarkStart w:id="8" w:name="_Toc199059256"/>
       <w:r>
         <w:t xml:space="preserve">Summary of </w:t>
       </w:r>
@@ -3094,16 +3094,14 @@
       </w:r>
     </w:p>
     <w:p>
-      <w:proofErr w:type="gramStart"/>
-      <w:r>
-        <w:t>6..</w:t>
-      </w:r>
-      <w:r>
-        <w:t>System</w:t>
-      </w:r>
-      <w:proofErr w:type="gramEnd"/>
-      <w:r>
-        <w:t xml:space="preserve"> Performance Expectations</w:t>
+      <w:r>
+        <w:t>6.</w:t>
+      </w:r>
+      <w:r>
+        <w:t xml:space="preserve"> </w:t>
+      </w:r>
+      <w:r>
+        <w:t>System Performance Expectations</w:t>
       </w:r>
     </w:p>
     <w:p>
@@ -3117,23 +3115,15 @@
       <w:r>
         <w:t xml:space="preserve">A page should not take longer than 1–2 seconds to load at </w:t>
       </w:r>
-      <w:proofErr w:type="spellStart"/>
-      <w:proofErr w:type="gramStart"/>
-      <w:r>
-        <w:t>most.The</w:t>
-      </w:r>
-      <w:proofErr w:type="spellEnd"/>
-      <w:proofErr w:type="gramEnd"/>
+      <w:r>
+        <w:t>most. The</w:t>
+      </w:r>
       <w:r>
         <w:t xml:space="preserve"> best response time for carpool matches should be 10–15 </w:t>
       </w:r>
-      <w:proofErr w:type="spellStart"/>
-      <w:proofErr w:type="gramStart"/>
-      <w:r>
-        <w:t>seconds.I</w:t>
-      </w:r>
-      <w:proofErr w:type="spellEnd"/>
-      <w:proofErr w:type="gramEnd"/>
+      <w:r>
+        <w:t>seconds. I</w:t>
+      </w:r>
       <w:r>
         <w:t xml:space="preserve"> recommend getting real-time parking updates at a rate of every 3–5 seconds</w:t>
       </w:r>
@@ -3172,11 +3162,9 @@
       <w:r>
         <w:t xml:space="preserve">Many users find it helpful that they get notified about changes in booked rides. The group was divided on chat — some found it useful, but it wasn’t considered </w:t>
       </w:r>
-      <w:proofErr w:type="gramStart"/>
-      <w:r>
-        <w:t>absolutely essential</w:t>
-      </w:r>
-      <w:proofErr w:type="gramEnd"/>
+      <w:r>
+        <w:t>essential</w:t>
+      </w:r>
       <w:r>
         <w:t xml:space="preserve"> by everyone.</w:t>
       </w:r>
@@ -3306,6 +3294,12 @@
     </w:p>
     <w:p>
       <w:r>
+        <w:br w:type="page"/>
+      </w:r>
+    </w:p>
+    <w:p>
+      <w:r>
+        <w:lastRenderedPageBreak/>
         <w:t>11. Theme and Visual Preferences</w:t>
       </w:r>
     </w:p>
@@ -3333,7 +3327,6 @@
         <w:rPr>
           <w:b/>
         </w:rPr>
-        <w:lastRenderedPageBreak/>
         <w:t>User Need</w:t>
       </w:r>
       <w:r>
@@ -3410,13 +3403,23 @@
         <w:t>: Implement a persistent or smart login feature to minimize repeated authentication.</w:t>
       </w:r>
     </w:p>
-    <w:p/>
+    <w:p>
+      <w:pPr>
+        <w:rPr>
+          <w:sz w:val="32"/>
+        </w:rPr>
+      </w:pPr>
+      <w:r>
+        <w:br w:type="page"/>
+      </w:r>
+    </w:p>
     <w:p>
       <w:pPr>
         <w:pStyle w:val="TNRHeading2"/>
       </w:pPr>
-      <w:bookmarkStart w:id="9" w:name="_Toc199005675"/>
-      <w:r>
+      <w:bookmarkStart w:id="9" w:name="_Toc199059257"/>
+      <w:r>
+        <w:lastRenderedPageBreak/>
         <w:t>4.3 Observation</w:t>
       </w:r>
       <w:bookmarkEnd w:id="9"/>
@@ -3467,7 +3470,7 @@
       <w:pPr>
         <w:pStyle w:val="TNRHeading3"/>
       </w:pPr>
-      <w:bookmarkStart w:id="10" w:name="_Toc199005676"/>
+      <w:bookmarkStart w:id="10" w:name="_Toc199059258"/>
       <w:r>
         <w:t>Key Observations</w:t>
       </w:r>
@@ -3633,11 +3636,7 @@
               <w:jc w:val="left"/>
             </w:pPr>
             <w:r>
-              <w:t xml:space="preserve">It is usually hard for students to find an available parking space. It’s one of the busiest areas in MMU </w:t>
-            </w:r>
-            <w:r>
-              <w:lastRenderedPageBreak/>
-              <w:t>Cyberjaya. Staff spaces are usually available but cannot be used by students. Students often spend 5–10 minutes looking for a space.</w:t>
+              <w:t>It is usually hard for students to find an available parking space. It’s one of the busiest areas in MMU Cyberjaya. Staff spaces are usually available but cannot be used by students. Students often spend 5–10 minutes looking for a space.</w:t>
             </w:r>
           </w:p>
           <w:p>
@@ -3665,12 +3664,7 @@
               <w:jc w:val="left"/>
             </w:pPr>
             <w:r>
-              <w:lastRenderedPageBreak/>
-              <w:t xml:space="preserve">Many students want to park at FCI. Making staff park away from the work site limits how they can get to </w:t>
-            </w:r>
-            <w:r>
-              <w:lastRenderedPageBreak/>
-              <w:t xml:space="preserve">work. Looking for a parking space usually takes time and can get stressful. </w:t>
+              <w:t xml:space="preserve">Many students want to park at FCI. Making staff park away from the work site limits how they can get to work. Looking for a parking space usually takes time and can get stressful. </w:t>
             </w:r>
           </w:p>
           <w:p>
@@ -3697,7 +3691,6 @@
               <w:jc w:val="left"/>
             </w:pPr>
             <w:r>
-              <w:lastRenderedPageBreak/>
               <w:t>Behind of library parking</w:t>
             </w:r>
           </w:p>
@@ -3738,7 +3731,11 @@
         </w:tc>
       </w:tr>
     </w:tbl>
-    <w:p/>
+    <w:p>
+      <w:r>
+        <w:br w:type="page"/>
+      </w:r>
+    </w:p>
     <w:p>
       <w:pPr>
         <w:rPr>
@@ -3751,6 +3748,7 @@
           <w:b/>
           <w:bCs/>
         </w:rPr>
+        <w:lastRenderedPageBreak/>
         <w:t>Initial User Needs Identified</w:t>
       </w:r>
     </w:p>
@@ -3814,11 +3812,12 @@
         <w:t>People should be alerted when parking elsewhere is possible, mainly during busy hours or special events.</w:t>
       </w:r>
     </w:p>
+    <w:p/>
     <w:p>
       <w:pPr>
         <w:pStyle w:val="TNRHeading1"/>
       </w:pPr>
-      <w:bookmarkStart w:id="11" w:name="_Toc199005677"/>
+      <w:bookmarkStart w:id="11" w:name="_Toc199059259"/>
       <w:r>
         <w:t>5 Conclusion</w:t>
       </w:r>
@@ -3836,7 +3835,6 @@
     </w:p>
     <w:p>
       <w:r>
-        <w:lastRenderedPageBreak/>
         <w:t>The data collected from all methods not only confirmed that the campus community is ready for a digital ridesharing and parking platform but also provided clear direction on which functionalities to prioritize. Using this strong base, the following steps will be planned to support user needs and the abilities of the institution.</w:t>
       </w:r>
     </w:p>

</xml_diff>